<commit_message>
SEQUOIADBMAINSTREAM-948: update story document
git-svn-id: http://192.168.20.11/sequoiadb/trunk@20339 6121f079-4a18-41d3-8c30-8870a322f2c2
</commit_message>
<xml_diff>
--- a/internal_doc/03.开发设计/Story-sdbimport_improvement.docx
+++ b/internal_doc/03.开发设计/Story-sdbimport_improvement.docx
@@ -65,14 +65,12 @@
               </w:rPr>
               <w:t xml:space="preserve">  </w:t>
             </w:r>
-            <w:proofErr w:type="spellStart"/>
             <w:r>
               <w:rPr>
                 <w:rFonts w:hint="eastAsia"/>
               </w:rPr>
               <w:t>liweichao</w:t>
             </w:r>
-            <w:proofErr w:type="spellEnd"/>
           </w:p>
         </w:tc>
         <w:tc>
@@ -298,114 +296,140 @@
           <w:color w:val="000000" w:themeColor="text1"/>
         </w:rPr>
       </w:pPr>
-      <w:proofErr w:type="spellStart"/>
       <w:r>
         <w:rPr>
           <w:rFonts w:asciiTheme="minorEastAsia" w:hAnsiTheme="minorEastAsia" w:hint="eastAsia"/>
           <w:color w:val="000000" w:themeColor="text1"/>
         </w:rPr>
-        <w:t>sdbimport</w:t>
-      </w:r>
-      <w:proofErr w:type="spellEnd"/>
+        <w:t>sdbimport工具</w:t>
+      </w:r>
       <w:r>
         <w:rPr>
           <w:rFonts w:asciiTheme="minorEastAsia" w:hAnsiTheme="minorEastAsia" w:hint="eastAsia"/>
           <w:color w:val="000000" w:themeColor="text1"/>
         </w:rPr>
-        <w:t>工具</w:t>
+        <w:t>用于将外部数据导入到SequoiaDB中，</w:t>
       </w:r>
       <w:r>
         <w:rPr>
           <w:rFonts w:asciiTheme="minorEastAsia" w:hAnsiTheme="minorEastAsia" w:hint="eastAsia"/>
           <w:color w:val="000000" w:themeColor="text1"/>
         </w:rPr>
-        <w:t>用于将外部数据导入到</w:t>
-      </w:r>
-      <w:proofErr w:type="spellStart"/>
+        <w:t>对于技术支持人员</w:t>
+      </w:r>
       <w:r>
         <w:rPr>
           <w:rFonts w:asciiTheme="minorEastAsia" w:hAnsiTheme="minorEastAsia" w:hint="eastAsia"/>
           <w:color w:val="000000" w:themeColor="text1"/>
         </w:rPr>
-        <w:t>SequoiaDB</w:t>
-      </w:r>
-      <w:proofErr w:type="spellEnd"/>
+        <w:t>和企业运维人员</w:t>
+      </w:r>
       <w:r>
         <w:rPr>
           <w:rFonts w:asciiTheme="minorEastAsia" w:hAnsiTheme="minorEastAsia" w:hint="eastAsia"/>
           <w:color w:val="000000" w:themeColor="text1"/>
         </w:rPr>
-        <w:t>中，</w:t>
+        <w:t>具有重要作用</w:t>
       </w:r>
       <w:r>
         <w:rPr>
           <w:rFonts w:asciiTheme="minorEastAsia" w:hAnsiTheme="minorEastAsia" w:hint="eastAsia"/>
           <w:color w:val="000000" w:themeColor="text1"/>
         </w:rPr>
-        <w:t>对于技术支持人员</w:t>
+        <w:t>。</w:t>
       </w:r>
       <w:r>
         <w:rPr>
           <w:rFonts w:asciiTheme="minorEastAsia" w:hAnsiTheme="minorEastAsia" w:hint="eastAsia"/>
           <w:color w:val="000000" w:themeColor="text1"/>
         </w:rPr>
-        <w:t>和企业运维人员</w:t>
+        <w:t>在实际使用过程中</w:t>
       </w:r>
       <w:r>
         <w:rPr>
           <w:rFonts w:asciiTheme="minorEastAsia" w:hAnsiTheme="minorEastAsia" w:hint="eastAsia"/>
           <w:color w:val="000000" w:themeColor="text1"/>
         </w:rPr>
-        <w:t>具有重要作用</w:t>
+        <w:t>发现现有的功能不能很好的满足</w:t>
       </w:r>
       <w:r>
         <w:rPr>
           <w:rFonts w:asciiTheme="minorEastAsia" w:hAnsiTheme="minorEastAsia" w:hint="eastAsia"/>
           <w:color w:val="000000" w:themeColor="text1"/>
         </w:rPr>
-        <w:t>。</w:t>
+        <w:t>需求</w:t>
       </w:r>
       <w:r>
         <w:rPr>
           <w:rFonts w:asciiTheme="minorEastAsia" w:hAnsiTheme="minorEastAsia" w:hint="eastAsia"/>
           <w:color w:val="000000" w:themeColor="text1"/>
         </w:rPr>
-        <w:t>在实际使用过程中</w:t>
+        <w:t>，</w:t>
       </w:r>
       <w:r>
         <w:rPr>
           <w:rFonts w:asciiTheme="minorEastAsia" w:hAnsiTheme="minorEastAsia" w:hint="eastAsia"/>
           <w:color w:val="000000" w:themeColor="text1"/>
         </w:rPr>
-        <w:t>发现现有的功能不能很好的满足</w:t>
+        <w:t>需要改进。</w:t>
       </w:r>
       <w:r>
         <w:rPr>
           <w:rFonts w:asciiTheme="minorEastAsia" w:hAnsiTheme="minorEastAsia" w:hint="eastAsia"/>
           <w:color w:val="000000" w:themeColor="text1"/>
         </w:rPr>
-        <w:t>需求</w:t>
-      </w:r>
+        <w:t>需要考虑以下场景：</w:t>
+      </w:r>
+    </w:p>
+    <w:p>
+      <w:pPr>
+        <w:rPr>
+          <w:rFonts w:asciiTheme="minorEastAsia" w:hAnsiTheme="minorEastAsia"/>
+          <w:color w:val="000000" w:themeColor="text1"/>
+        </w:rPr>
+      </w:pPr>
       <w:r>
         <w:rPr>
           <w:rFonts w:asciiTheme="minorEastAsia" w:hAnsiTheme="minorEastAsia" w:hint="eastAsia"/>
           <w:color w:val="000000" w:themeColor="text1"/>
         </w:rPr>
-        <w:t>，</w:t>
-      </w:r>
+        <w:t xml:space="preserve">1、导入工具在导入大数据量（单个文件达到100G甚至T级）时，性能极慢； </w:t>
+      </w:r>
+    </w:p>
+    <w:p>
+      <w:pPr>
+        <w:rPr>
+          <w:rFonts w:asciiTheme="minorEastAsia" w:hAnsiTheme="minorEastAsia"/>
+          <w:color w:val="000000" w:themeColor="text1"/>
+        </w:rPr>
+      </w:pPr>
       <w:r>
         <w:rPr>
           <w:rFonts w:asciiTheme="minorEastAsia" w:hAnsiTheme="minorEastAsia" w:hint="eastAsia"/>
           <w:color w:val="000000" w:themeColor="text1"/>
         </w:rPr>
-        <w:t>需要改进。</w:t>
+        <w:t>2</w:t>
       </w:r>
       <w:r>
         <w:rPr>
           <w:rFonts w:asciiTheme="minorEastAsia" w:hAnsiTheme="minorEastAsia" w:hint="eastAsia"/>
           <w:color w:val="000000" w:themeColor="text1"/>
         </w:rPr>
-        <w:t>需要考虑以下场景：</w:t>
+        <w:t>、导入工具对于大批</w:t>
+      </w:r>
+      <w:r>
+        <w:rPr>
+          <w:rFonts w:asciiTheme="minorEastAsia" w:hAnsiTheme="minorEastAsia" w:hint="eastAsia"/>
+          <w:color w:val="000000" w:themeColor="text1"/>
+        </w:rPr>
+        <w:t>量导入数据失败时，不能有效识别</w:t>
+      </w:r>
+      <w:r>
+        <w:rPr>
+          <w:rFonts w:asciiTheme="minorEastAsia" w:hAnsiTheme="minorEastAsia" w:hint="eastAsia"/>
+          <w:color w:val="000000" w:themeColor="text1"/>
+        </w:rPr>
+        <w:t xml:space="preserve">出失败的数据； </w:t>
       </w:r>
     </w:p>
     <w:p>
@@ -420,7 +444,21 @@
           <w:rFonts w:asciiTheme="minorEastAsia" w:hAnsiTheme="minorEastAsia" w:hint="eastAsia"/>
           <w:color w:val="000000" w:themeColor="text1"/>
         </w:rPr>
-        <w:t xml:space="preserve">1、导入工具在导入大数据量（单个文件达到100G甚至T级）时，性能极慢； </w:t>
+        <w:t>3、导入工具对分隔符的适配有限，不支持</w:t>
+      </w:r>
+      <w:r>
+        <w:rPr>
+          <w:rFonts w:asciiTheme="minorEastAsia" w:hAnsiTheme="minorEastAsia" w:hint="eastAsia"/>
+          <w:color w:val="000000" w:themeColor="text1"/>
+        </w:rPr>
+        <w:t>多字符</w:t>
+      </w:r>
+      <w:r>
+        <w:rPr>
+          <w:rFonts w:asciiTheme="minorEastAsia" w:hAnsiTheme="minorEastAsia" w:hint="eastAsia"/>
+          <w:color w:val="000000" w:themeColor="text1"/>
+        </w:rPr>
+        <w:t xml:space="preserve">； </w:t>
       </w:r>
     </w:p>
     <w:p>
@@ -435,28 +473,28 @@
           <w:rFonts w:asciiTheme="minorEastAsia" w:hAnsiTheme="minorEastAsia" w:hint="eastAsia"/>
           <w:color w:val="000000" w:themeColor="text1"/>
         </w:rPr>
-        <w:t>2</w:t>
+        <w:t>4、导入工具对字段</w:t>
       </w:r>
       <w:r>
         <w:rPr>
           <w:rFonts w:asciiTheme="minorEastAsia" w:hAnsiTheme="minorEastAsia" w:hint="eastAsia"/>
           <w:color w:val="000000" w:themeColor="text1"/>
         </w:rPr>
-        <w:t>、导入工具对于大批</w:t>
+        <w:t>数据</w:t>
       </w:r>
       <w:r>
         <w:rPr>
           <w:rFonts w:asciiTheme="minorEastAsia" w:hAnsiTheme="minorEastAsia" w:hint="eastAsia"/>
           <w:color w:val="000000" w:themeColor="text1"/>
         </w:rPr>
-        <w:t>量导入数据失败时，不能有效识别</w:t>
+        <w:t>类型格式转换支持不完善</w:t>
       </w:r>
       <w:r>
         <w:rPr>
           <w:rFonts w:asciiTheme="minorEastAsia" w:hAnsiTheme="minorEastAsia" w:hint="eastAsia"/>
           <w:color w:val="000000" w:themeColor="text1"/>
         </w:rPr>
-        <w:t xml:space="preserve">出失败的数据； </w:t>
+        <w:t>；</w:t>
       </w:r>
     </w:p>
     <w:p>
@@ -471,88 +509,7 @@
           <w:rFonts w:asciiTheme="minorEastAsia" w:hAnsiTheme="minorEastAsia" w:hint="eastAsia"/>
           <w:color w:val="000000" w:themeColor="text1"/>
         </w:rPr>
-        <w:t>3、导入工具对分隔符的适配有限，不支持</w:t>
-      </w:r>
-      <w:r>
-        <w:rPr>
-          <w:rFonts w:asciiTheme="minorEastAsia" w:hAnsiTheme="minorEastAsia" w:hint="eastAsia"/>
-          <w:color w:val="000000" w:themeColor="text1"/>
-        </w:rPr>
-        <w:t>多字符</w:t>
-      </w:r>
-      <w:r>
-        <w:rPr>
-          <w:rFonts w:asciiTheme="minorEastAsia" w:hAnsiTheme="minorEastAsia" w:hint="eastAsia"/>
-          <w:color w:val="000000" w:themeColor="text1"/>
-        </w:rPr>
-        <w:t xml:space="preserve">； </w:t>
-      </w:r>
-    </w:p>
-    <w:p>
-      <w:pPr>
-        <w:rPr>
-          <w:rFonts w:asciiTheme="minorEastAsia" w:hAnsiTheme="minorEastAsia"/>
-          <w:color w:val="000000" w:themeColor="text1"/>
-        </w:rPr>
-      </w:pPr>
-      <w:r>
-        <w:rPr>
-          <w:rFonts w:asciiTheme="minorEastAsia" w:hAnsiTheme="minorEastAsia" w:hint="eastAsia"/>
-          <w:color w:val="000000" w:themeColor="text1"/>
-        </w:rPr>
-        <w:t>4、导入工具对字段</w:t>
-      </w:r>
-      <w:r>
-        <w:rPr>
-          <w:rFonts w:asciiTheme="minorEastAsia" w:hAnsiTheme="minorEastAsia" w:hint="eastAsia"/>
-          <w:color w:val="000000" w:themeColor="text1"/>
-        </w:rPr>
-        <w:t>数据</w:t>
-      </w:r>
-      <w:r>
-        <w:rPr>
-          <w:rFonts w:asciiTheme="minorEastAsia" w:hAnsiTheme="minorEastAsia" w:hint="eastAsia"/>
-          <w:color w:val="000000" w:themeColor="text1"/>
-        </w:rPr>
-        <w:t>类型格式转换支持不完善</w:t>
-      </w:r>
-      <w:r>
-        <w:rPr>
-          <w:rFonts w:asciiTheme="minorEastAsia" w:hAnsiTheme="minorEastAsia" w:hint="eastAsia"/>
-          <w:color w:val="000000" w:themeColor="text1"/>
-        </w:rPr>
-        <w:t>；</w:t>
-      </w:r>
-    </w:p>
-    <w:p>
-      <w:pPr>
-        <w:rPr>
-          <w:rFonts w:asciiTheme="minorEastAsia" w:hAnsiTheme="minorEastAsia"/>
-          <w:color w:val="000000" w:themeColor="text1"/>
-        </w:rPr>
-      </w:pPr>
-      <w:r>
-        <w:rPr>
-          <w:rFonts w:asciiTheme="minorEastAsia" w:hAnsiTheme="minorEastAsia" w:hint="eastAsia"/>
-          <w:color w:val="000000" w:themeColor="text1"/>
-        </w:rPr>
-        <w:t>5、用户在从db2等导入数据到</w:t>
-      </w:r>
-      <w:proofErr w:type="spellStart"/>
-      <w:r>
-        <w:rPr>
-          <w:rFonts w:asciiTheme="minorEastAsia" w:hAnsiTheme="minorEastAsia" w:hint="eastAsia"/>
-          <w:color w:val="000000" w:themeColor="text1"/>
-        </w:rPr>
-        <w:t>sequoiadb</w:t>
-      </w:r>
-      <w:proofErr w:type="spellEnd"/>
-      <w:r>
-        <w:rPr>
-          <w:rFonts w:asciiTheme="minorEastAsia" w:hAnsiTheme="minorEastAsia" w:hint="eastAsia"/>
-          <w:color w:val="000000" w:themeColor="text1"/>
-        </w:rPr>
-        <w:t>时不需要让数据落地</w:t>
+        <w:t>5、用户在从db2等导入数据到sequoiadb时不需要让数据落地</w:t>
       </w:r>
       <w:r>
         <w:rPr>
@@ -873,9 +830,6 @@
           <w:numId w:val="4"/>
         </w:numPr>
         <w:ind w:firstLineChars="0"/>
-        <w:rPr>
-          <w:rFonts w:hint="eastAsia"/>
-        </w:rPr>
       </w:pPr>
       <w:r>
         <w:rPr>
@@ -898,9 +852,6 @@
           <w:numId w:val="4"/>
         </w:numPr>
         <w:ind w:firstLineChars="0"/>
-        <w:rPr>
-          <w:rFonts w:hint="eastAsia"/>
-        </w:rPr>
       </w:pPr>
       <w:r>
         <w:rPr>
@@ -917,9 +868,6 @@
           <w:numId w:val="4"/>
         </w:numPr>
         <w:ind w:firstLineChars="0"/>
-        <w:rPr>
-          <w:rFonts w:hint="eastAsia"/>
-        </w:rPr>
       </w:pPr>
       <w:r>
         <w:rPr>
@@ -948,9 +896,6 @@
           <w:numId w:val="4"/>
         </w:numPr>
         <w:ind w:firstLineChars="0"/>
-        <w:rPr>
-          <w:rFonts w:hint="eastAsia"/>
-        </w:rPr>
       </w:pPr>
       <w:r>
         <w:rPr>
@@ -979,6 +924,9 @@
           <w:numId w:val="4"/>
         </w:numPr>
         <w:ind w:firstLineChars="0"/>
+        <w:rPr>
+          <w:rFonts w:hint="eastAsia"/>
+        </w:rPr>
       </w:pPr>
       <w:r>
         <w:rPr>
@@ -992,14 +940,12 @@
         </w:rPr>
         <w:t>按</w:t>
       </w:r>
-      <w:proofErr w:type="spellStart"/>
       <w:r>
         <w:rPr>
           <w:rFonts w:hint="eastAsia"/>
         </w:rPr>
         <w:t>sharding</w:t>
       </w:r>
-      <w:proofErr w:type="spellEnd"/>
       <w:r>
         <w:rPr>
           <w:rFonts w:hint="eastAsia"/>
@@ -1035,61 +981,7 @@
         <w:rPr>
           <w:rFonts w:hint="eastAsia"/>
         </w:rPr>
-        <w:t>导入工具</w:t>
-      </w:r>
-      <w:r>
-        <w:rPr>
-          <w:rFonts w:hint="eastAsia"/>
-        </w:rPr>
-        <w:t>被中断后</w:t>
-      </w:r>
-      <w:r>
-        <w:rPr>
-          <w:rFonts w:hint="eastAsia"/>
-        </w:rPr>
-        <w:t>（</w:t>
-      </w:r>
-      <w:r>
-        <w:rPr>
-          <w:rFonts w:hint="eastAsia"/>
-        </w:rPr>
-        <w:t>kill -15</w:t>
-      </w:r>
-      <w:r>
-        <w:rPr>
-          <w:rFonts w:hint="eastAsia"/>
-        </w:rPr>
-        <w:t>）</w:t>
-      </w:r>
-      <w:r>
-        <w:rPr>
-          <w:rFonts w:hint="eastAsia"/>
-        </w:rPr>
-        <w:t>可以</w:t>
-      </w:r>
-      <w:r>
-        <w:rPr>
-          <w:rFonts w:hint="eastAsia"/>
-        </w:rPr>
-        <w:t>从中断处开始继续</w:t>
-      </w:r>
-      <w:r>
-        <w:rPr>
-          <w:rFonts w:hint="eastAsia"/>
-        </w:rPr>
-        <w:t>导入</w:t>
-      </w:r>
-      <w:r>
-        <w:rPr>
-          <w:rFonts w:hint="eastAsia"/>
-        </w:rPr>
-        <w:t>（低优先级）</w:t>
-      </w:r>
-      <w:r>
-        <w:rPr>
-          <w:rFonts w:hint="eastAsia"/>
-        </w:rPr>
-        <w:t>；</w:t>
+        <w:t>支持输入多个协调节点地址；</w:t>
       </w:r>
     </w:p>
     <w:p>
@@ -1100,18 +992,51 @@
           <w:numId w:val="4"/>
         </w:numPr>
         <w:ind w:firstLineChars="0"/>
-      </w:pPr>
-      <w:r>
-        <w:rPr>
-          <w:rFonts w:hint="eastAsia"/>
-        </w:rPr>
-        <w:t>指定导入的记录数量，指定起始导入位置</w:t>
-      </w:r>
-      <w:r>
-        <w:rPr>
-          <w:rFonts w:hint="eastAsia"/>
-        </w:rPr>
-        <w:t>（低优先级）</w:t>
+        <w:rPr>
+          <w:rFonts w:hint="eastAsia"/>
+        </w:rPr>
+      </w:pPr>
+      <w:r>
+        <w:rPr>
+          <w:rFonts w:hint="eastAsia"/>
+        </w:rPr>
+        <w:t>分隔符支持不可见字符，使用</w:t>
+      </w:r>
+      <w:r>
+        <w:rPr>
+          <w:rFonts w:hint="eastAsia"/>
+        </w:rPr>
+        <w:t>'\</w:t>
+      </w:r>
+      <w:r>
+        <w:rPr>
+          <w:rFonts w:hint="eastAsia"/>
+        </w:rPr>
+        <w:t>数值</w:t>
+      </w:r>
+      <w:r>
+        <w:rPr>
+          <w:rFonts w:hint="eastAsia"/>
+        </w:rPr>
+        <w:t>'</w:t>
+      </w:r>
+      <w:r>
+        <w:rPr>
+          <w:rFonts w:hint="eastAsia"/>
+        </w:rPr>
+        <w:t>表示</w:t>
+      </w:r>
+      <w:r>
+        <w:rPr>
+          <w:rFonts w:hint="eastAsia"/>
+        </w:rPr>
+        <w:t>ASCII</w:t>
+      </w:r>
+      <w:r>
+        <w:rPr>
+          <w:rFonts w:hint="eastAsia"/>
+        </w:rPr>
+        <w:t>字符</w:t>
       </w:r>
       <w:r>
         <w:rPr>
@@ -1128,24 +1053,27 @@
           <w:numId w:val="4"/>
         </w:numPr>
         <w:ind w:firstLineChars="0"/>
-      </w:pPr>
-      <w:r>
-        <w:rPr>
-          <w:rFonts w:hint="eastAsia"/>
-        </w:rPr>
-        <w:t>支持</w:t>
-      </w:r>
-      <w:r>
-        <w:rPr>
-          <w:rFonts w:hint="eastAsia"/>
-        </w:rPr>
-        <w:t>通过正则表达式指定字段的类型转换方式</w:t>
-      </w:r>
-      <w:r>
-        <w:rPr>
-          <w:rFonts w:hint="eastAsia"/>
-        </w:rPr>
-        <w:t>（低优先级）</w:t>
+        <w:rPr>
+          <w:rFonts w:hint="eastAsia"/>
+        </w:rPr>
+      </w:pPr>
+      <w:r>
+        <w:rPr>
+          <w:rFonts w:hint="eastAsia"/>
+        </w:rPr>
+        <w:t>bool</w:t>
+      </w:r>
+      <w:r>
+        <w:rPr>
+          <w:rFonts w:hint="eastAsia"/>
+        </w:rPr>
+        <w:t>类型支持</w:t>
+      </w:r>
+      <w:r>
+        <w:rPr>
+          <w:rFonts w:hint="eastAsia"/>
+        </w:rPr>
+        <w:t>t/f/yes/no/y/n</w:t>
       </w:r>
       <w:r>
         <w:rPr>
@@ -1162,6 +1090,9 @@
           <w:numId w:val="4"/>
         </w:numPr>
         <w:ind w:firstLineChars="0"/>
+        <w:rPr>
+          <w:rFonts w:hint="eastAsia"/>
+        </w:rPr>
       </w:pPr>
       <w:r>
         <w:rPr>
@@ -1174,61 +1105,366 @@
         <w:rPr>
           <w:rFonts w:hint="eastAsia"/>
         </w:rPr>
-        <w:t>使用</w:t>
-      </w:r>
-      <w:r>
-        <w:rPr>
-          <w:rFonts w:hint="eastAsia"/>
-        </w:rPr>
-        <w:t>GB2312</w:t>
-      </w:r>
-      <w:r>
-        <w:rPr>
-          <w:rFonts w:hint="eastAsia"/>
-        </w:rPr>
-        <w:t>、</w:t>
-      </w:r>
-      <w:r>
-        <w:rPr>
-          <w:rFonts w:hint="eastAsia"/>
-        </w:rPr>
-        <w:t>GBK</w:t>
-      </w:r>
-      <w:r>
-        <w:rPr>
-          <w:rFonts w:hint="eastAsia"/>
-        </w:rPr>
-        <w:t>、</w:t>
-      </w:r>
-      <w:r>
-        <w:rPr>
-          <w:rFonts w:hint="eastAsia"/>
-        </w:rPr>
-        <w:t>GB18030</w:t>
-      </w:r>
-      <w:r>
-        <w:rPr>
-          <w:rFonts w:hint="eastAsia"/>
-        </w:rPr>
-        <w:t>编码</w:t>
-      </w:r>
-      <w:r>
-        <w:rPr>
-          <w:rFonts w:hint="eastAsia"/>
-        </w:rPr>
-        <w:t>的文件</w:t>
-      </w:r>
-      <w:r>
-        <w:rPr>
-          <w:rFonts w:hint="eastAsia"/>
-        </w:rPr>
-        <w:t>（低优先级）</w:t>
-      </w:r>
-      <w:r>
-        <w:rPr>
-          <w:rFonts w:hint="eastAsia"/>
-        </w:rPr>
-        <w:t>。</w:t>
+        <w:t>#</w:t>
+      </w:r>
+      <w:r>
+        <w:rPr>
+          <w:rFonts w:hint="eastAsia"/>
+        </w:rPr>
+        <w:t>开头的数字</w:t>
+      </w:r>
+      <w:r>
+        <w:rPr>
+          <w:rFonts w:hint="eastAsia"/>
+        </w:rPr>
+        <w:t>；</w:t>
+      </w:r>
+    </w:p>
+    <w:p>
+      <w:pPr>
+        <w:pStyle w:val="ListParagraph"/>
+        <w:numPr>
+          <w:ilvl w:val="0"/>
+          <w:numId w:val="4"/>
+        </w:numPr>
+        <w:ind w:firstLineChars="0"/>
+        <w:rPr>
+          <w:rFonts w:hint="eastAsia"/>
+        </w:rPr>
+      </w:pPr>
+      <w:r>
+        <w:rPr>
+          <w:rFonts w:hint="eastAsia"/>
+        </w:rPr>
+        <w:t>用参数</w:t>
+      </w:r>
+      <w:r>
+        <w:rPr>
+          <w:rFonts w:hint="eastAsia"/>
+        </w:rPr>
+        <w:t>--cast</w:t>
+      </w:r>
+      <w:r>
+        <w:rPr>
+          <w:rFonts w:hint="eastAsia"/>
+        </w:rPr>
+        <w:t>控制是否允许精度损失</w:t>
+      </w:r>
+      <w:r>
+        <w:rPr>
+          <w:rFonts w:hint="eastAsia"/>
+        </w:rPr>
+        <w:t>；</w:t>
+      </w:r>
+    </w:p>
+    <w:p>
+      <w:pPr>
+        <w:pStyle w:val="ListParagraph"/>
+        <w:numPr>
+          <w:ilvl w:val="0"/>
+          <w:numId w:val="4"/>
+        </w:numPr>
+        <w:ind w:firstLineChars="0"/>
+        <w:rPr>
+          <w:rFonts w:hint="eastAsia"/>
+        </w:rPr>
+      </w:pPr>
+      <w:r>
+        <w:rPr>
+          <w:rFonts w:hint="eastAsia"/>
+        </w:rPr>
+        <w:t>支持自定义日期和时间戳格式</w:t>
+      </w:r>
+      <w:r>
+        <w:rPr>
+          <w:rFonts w:hint="eastAsia"/>
+        </w:rPr>
+        <w:t>,--datefmt, --timestampfmt</w:t>
+      </w:r>
+      <w:r>
+        <w:rPr>
+          <w:rFonts w:hint="eastAsia"/>
+        </w:rPr>
+        <w:t>；</w:t>
+      </w:r>
+    </w:p>
+    <w:p>
+      <w:pPr>
+        <w:pStyle w:val="ListParagraph"/>
+        <w:numPr>
+          <w:ilvl w:val="0"/>
+          <w:numId w:val="4"/>
+        </w:numPr>
+        <w:ind w:firstLineChars="0"/>
+        <w:rPr>
+          <w:rFonts w:hint="eastAsia"/>
+        </w:rPr>
+      </w:pPr>
+      <w:r>
+        <w:rPr>
+          <w:rFonts w:hint="eastAsia"/>
+        </w:rPr>
+        <w:t>支持输入文件目录和多个文件</w:t>
+      </w:r>
+      <w:r>
+        <w:rPr>
+          <w:rFonts w:hint="eastAsia"/>
+        </w:rPr>
+        <w:t>；</w:t>
+      </w:r>
+    </w:p>
+    <w:p>
+      <w:pPr>
+        <w:pStyle w:val="ListParagraph"/>
+        <w:numPr>
+          <w:ilvl w:val="0"/>
+          <w:numId w:val="4"/>
+        </w:numPr>
+        <w:ind w:firstLineChars="0"/>
+        <w:rPr>
+          <w:rFonts w:hint="eastAsia"/>
+        </w:rPr>
+      </w:pPr>
+      <w:r>
+        <w:rPr>
+          <w:rFonts w:hint="eastAsia"/>
+        </w:rPr>
+        <w:t>字段名支持引号括起带空格</w:t>
+      </w:r>
+      <w:r>
+        <w:rPr>
+          <w:rFonts w:hint="eastAsia"/>
+        </w:rPr>
+        <w:t>；</w:t>
+      </w:r>
+    </w:p>
+    <w:p>
+      <w:pPr>
+        <w:pStyle w:val="ListParagraph"/>
+        <w:numPr>
+          <w:ilvl w:val="0"/>
+          <w:numId w:val="4"/>
+        </w:numPr>
+        <w:ind w:firstLineChars="0"/>
+        <w:rPr>
+          <w:rFonts w:hint="eastAsia"/>
+        </w:rPr>
+      </w:pPr>
+      <w:r>
+        <w:rPr>
+          <w:rFonts w:hint="eastAsia"/>
+        </w:rPr>
+        <w:t>数据类型转换出错、数字溢出和截断时会报错，保存原始记录到</w:t>
+      </w:r>
+      <w:r>
+        <w:rPr>
+          <w:rFonts w:hint="eastAsia"/>
+        </w:rPr>
+        <w:t>parse</w:t>
+      </w:r>
+      <w:r>
+        <w:rPr>
+          <w:rFonts w:hint="eastAsia"/>
+        </w:rPr>
+        <w:t>文件中；</w:t>
+      </w:r>
+    </w:p>
+    <w:p>
+      <w:pPr>
+        <w:pStyle w:val="ListParagraph"/>
+        <w:numPr>
+          <w:ilvl w:val="0"/>
+          <w:numId w:val="4"/>
+        </w:numPr>
+        <w:ind w:firstLineChars="0"/>
+        <w:rPr>
+          <w:rFonts w:hint="eastAsia"/>
+        </w:rPr>
+      </w:pPr>
+      <w:r>
+        <w:rPr>
+          <w:rFonts w:hint="eastAsia"/>
+        </w:rPr>
+        <w:t>记录按分区打包时，如果未找到该记录的分区信息，会保存记录的</w:t>
+      </w:r>
+      <w:r>
+        <w:rPr>
+          <w:rFonts w:hint="eastAsia"/>
+        </w:rPr>
+        <w:t>json</w:t>
+      </w:r>
+      <w:r>
+        <w:rPr>
+          <w:rFonts w:hint="eastAsia"/>
+        </w:rPr>
+        <w:t>形式到</w:t>
+      </w:r>
+      <w:r>
+        <w:rPr>
+          <w:rFonts w:hint="eastAsia"/>
+        </w:rPr>
+        <w:t>sharding</w:t>
+      </w:r>
+      <w:r>
+        <w:rPr>
+          <w:rFonts w:hint="eastAsia"/>
+        </w:rPr>
+        <w:t>文件中</w:t>
+      </w:r>
+      <w:r>
+        <w:rPr>
+          <w:rFonts w:hint="eastAsia"/>
+        </w:rPr>
+        <w:t>；</w:t>
+      </w:r>
+    </w:p>
+    <w:p>
+      <w:pPr>
+        <w:pStyle w:val="ListParagraph"/>
+        <w:numPr>
+          <w:ilvl w:val="0"/>
+          <w:numId w:val="4"/>
+        </w:numPr>
+        <w:ind w:firstLineChars="0"/>
+        <w:rPr>
+          <w:rFonts w:hint="eastAsia"/>
+        </w:rPr>
+      </w:pPr>
+      <w:r>
+        <w:rPr>
+          <w:rFonts w:hint="eastAsia"/>
+        </w:rPr>
+        <w:t>记录导入数据库失败时，会保存记录的</w:t>
+      </w:r>
+      <w:r>
+        <w:rPr>
+          <w:rFonts w:hint="eastAsia"/>
+        </w:rPr>
+        <w:t>json</w:t>
+      </w:r>
+      <w:r>
+        <w:rPr>
+          <w:rFonts w:hint="eastAsia"/>
+        </w:rPr>
+        <w:t>形式到</w:t>
+      </w:r>
+      <w:r>
+        <w:rPr>
+          <w:rFonts w:hint="eastAsia"/>
+        </w:rPr>
+        <w:t>import</w:t>
+      </w:r>
+      <w:r>
+        <w:rPr>
+          <w:rFonts w:hint="eastAsia"/>
+        </w:rPr>
+        <w:t>文件中</w:t>
+      </w:r>
+      <w:r>
+        <w:rPr>
+          <w:rFonts w:hint="eastAsia"/>
+        </w:rPr>
+        <w:t>；</w:t>
+      </w:r>
+    </w:p>
+    <w:p>
+      <w:pPr>
+        <w:pStyle w:val="ListParagraph"/>
+        <w:numPr>
+          <w:ilvl w:val="0"/>
+          <w:numId w:val="4"/>
+        </w:numPr>
+        <w:ind w:firstLineChars="0"/>
+      </w:pPr>
+      <w:r>
+        <w:rPr>
+          <w:rFonts w:hint="eastAsia"/>
+        </w:rPr>
+        <w:t>失败记录导出文件的命名格式为</w:t>
+      </w:r>
+      <w:r>
+        <w:rPr>
+          <w:rFonts w:hint="eastAsia"/>
+        </w:rPr>
+        <w:t>"&lt;</w:t>
+      </w:r>
+      <w:r>
+        <w:rPr>
+          <w:rFonts w:hint="eastAsia"/>
+        </w:rPr>
+        <w:t>集合空间</w:t>
+      </w:r>
+      <w:r>
+        <w:rPr>
+          <w:rFonts w:hint="eastAsia"/>
+        </w:rPr>
+        <w:t>&gt;_&lt;</w:t>
+      </w:r>
+      <w:r>
+        <w:rPr>
+          <w:rFonts w:hint="eastAsia"/>
+        </w:rPr>
+        <w:t>集合</w:t>
+      </w:r>
+      <w:r>
+        <w:rPr>
+          <w:rFonts w:hint="eastAsia"/>
+        </w:rPr>
+        <w:t>&gt;_&lt;</w:t>
+      </w:r>
+      <w:r>
+        <w:rPr>
+          <w:rFonts w:hint="eastAsia"/>
+        </w:rPr>
+        <w:t>出错阶段</w:t>
+      </w:r>
+      <w:r>
+        <w:rPr>
+          <w:rFonts w:hint="eastAsia"/>
+        </w:rPr>
+        <w:t>&gt;_&lt;pid&gt;.rec"</w:t>
+      </w:r>
+      <w:r>
+        <w:rPr>
+          <w:rFonts w:hint="eastAsia"/>
+        </w:rPr>
+        <w:t>，例如向集合空间</w:t>
+      </w:r>
+      <w:r>
+        <w:rPr>
+          <w:rFonts w:hint="eastAsia"/>
+        </w:rPr>
+        <w:t>foo</w:t>
+      </w:r>
+      <w:r>
+        <w:rPr>
+          <w:rFonts w:hint="eastAsia"/>
+        </w:rPr>
+        <w:t>的集合</w:t>
+      </w:r>
+      <w:r>
+        <w:rPr>
+          <w:rFonts w:hint="eastAsia"/>
+        </w:rPr>
+        <w:t>bar</w:t>
+      </w:r>
+      <w:r>
+        <w:rPr>
+          <w:rFonts w:hint="eastAsia"/>
+        </w:rPr>
+        <w:t>导入数据，在解析阶段出错的记录会保存到</w:t>
+      </w:r>
+      <w:r>
+        <w:rPr>
+          <w:rFonts w:hint="eastAsia"/>
+        </w:rPr>
+        <w:t>foo_bar_parse_&lt;pid&gt;.rec</w:t>
+      </w:r>
+      <w:r>
+        <w:rPr>
+          <w:rFonts w:hint="eastAsia"/>
+        </w:rPr>
+        <w:t>中。</w:t>
       </w:r>
     </w:p>
     <w:p>
@@ -1382,7 +1618,7 @@
         <w:jc w:val="center"/>
       </w:pPr>
       <w:r>
-        <w:object w:dxaOrig="4276" w:dyaOrig="6575">
+        <w:object w:dxaOrig="4276" w:dyaOrig="8275">
           <v:shapetype id="_x0000_t75" coordsize="21600,21600" o:spt="75" o:preferrelative="t" path="m@4@5l@4@11@9@11@9@5xe" filled="f" stroked="f">
             <v:stroke joinstyle="miter"/>
             <v:formulas>
@@ -1402,10 +1638,10 @@
             <v:path o:extrusionok="f" gradientshapeok="t" o:connecttype="rect"/>
             <o:lock v:ext="edit" aspectratio="t"/>
           </v:shapetype>
-          <v:shape id="_x0000_i1025" type="#_x0000_t75" style="width:213.85pt;height:328.85pt" o:ole="">
+          <v:shape id="_x0000_i1025" type="#_x0000_t75" style="width:213.85pt;height:413.75pt" o:ole="">
             <v:imagedata r:id="rId6" o:title=""/>
           </v:shape>
-          <o:OLEObject Type="Embed" ProgID="Visio.Drawing.11" ShapeID="_x0000_i1025" DrawAspect="Content" ObjectID="_1499670488" r:id="rId7"/>
+          <o:OLEObject Type="Embed" ProgID="Visio.Drawing.11" ShapeID="_x0000_i1025" DrawAspect="Content" ObjectID="_1502538807" r:id="rId7"/>
         </w:object>
       </w:r>
     </w:p>
@@ -1468,11 +1704,11 @@
     <w:p/>
     <w:p>
       <w:r>
-        <w:object w:dxaOrig="9741" w:dyaOrig="8181">
-          <v:shape id="_x0000_i1026" type="#_x0000_t75" style="width:414.8pt;height:348.7pt" o:ole="">
+        <w:object w:dxaOrig="12459" w:dyaOrig="8186">
+          <v:shape id="_x0000_i1026" type="#_x0000_t75" style="width:414.8pt;height:272.4pt" o:ole="">
             <v:imagedata r:id="rId8" o:title=""/>
           </v:shape>
-          <o:OLEObject Type="Embed" ProgID="Visio.Drawing.11" ShapeID="_x0000_i1026" DrawAspect="Content" ObjectID="_1499670489" r:id="rId9"/>
+          <o:OLEObject Type="Embed" ProgID="Visio.Drawing.11" ShapeID="_x0000_i1026" DrawAspect="Content" ObjectID="_1502538808" r:id="rId9"/>
         </w:object>
       </w:r>
     </w:p>
@@ -1912,7 +2148,6 @@
         <w:rPr>
           <w:rFonts w:hint="eastAsia"/>
         </w:rPr>
-        <w:lastRenderedPageBreak/>
         <w:t>Checklist</w:t>
       </w:r>
     </w:p>
@@ -2036,6 +2271,12 @@
             <w:pPr>
               <w:ind w:left="0"/>
             </w:pPr>
+            <w:r>
+              <w:rPr>
+                <w:rFonts w:hint="eastAsia"/>
+              </w:rPr>
+              <w:t>Y</w:t>
+            </w:r>
           </w:p>
         </w:tc>
         <w:tc>
@@ -2062,6 +2303,7 @@
               <w:rPr>
                 <w:rFonts w:hint="eastAsia"/>
               </w:rPr>
+              <w:lastRenderedPageBreak/>
               <w:t>Story</w:t>
             </w:r>
             <w:r>
@@ -2080,6 +2322,12 @@
             <w:pPr>
               <w:ind w:left="0"/>
             </w:pPr>
+            <w:r>
+              <w:rPr>
+                <w:rFonts w:hint="eastAsia"/>
+              </w:rPr>
+              <w:t>Y</w:t>
+            </w:r>
           </w:p>
         </w:tc>
         <w:tc>
@@ -2118,6 +2366,12 @@
             <w:pPr>
               <w:ind w:left="0"/>
             </w:pPr>
+            <w:r>
+              <w:rPr>
+                <w:rFonts w:hint="eastAsia"/>
+              </w:rPr>
+              <w:t>Y</w:t>
+            </w:r>
           </w:p>
         </w:tc>
         <w:tc>
@@ -2156,6 +2410,12 @@
             <w:pPr>
               <w:ind w:left="0"/>
             </w:pPr>
+            <w:r>
+              <w:rPr>
+                <w:rFonts w:hint="eastAsia"/>
+              </w:rPr>
+              <w:t>Y</w:t>
+            </w:r>
           </w:p>
         </w:tc>
         <w:tc>
@@ -2194,6 +2454,12 @@
             <w:pPr>
               <w:ind w:left="0"/>
             </w:pPr>
+            <w:r>
+              <w:rPr>
+                <w:rFonts w:hint="eastAsia"/>
+              </w:rPr>
+              <w:t>NA</w:t>
+            </w:r>
           </w:p>
         </w:tc>
         <w:tc>
@@ -2232,6 +2498,12 @@
             <w:pPr>
               <w:ind w:left="0"/>
             </w:pPr>
+            <w:r>
+              <w:rPr>
+                <w:rFonts w:hint="eastAsia"/>
+              </w:rPr>
+              <w:t>NA</w:t>
+            </w:r>
           </w:p>
         </w:tc>
         <w:tc>

</xml_diff>